<commit_message>
build: generate RU EN UA CV document previews
</commit_message>
<xml_diff>
--- a/Releases/EN/Yuriy_Kobylyatskiy_Senior_Unity_Developer_EN.docx
+++ b/Releases/EN/Yuriy_Kobylyatskiy_Senior_Unity_Developer_EN.docx
@@ -121,19 +121,7 @@
     </w:p>
     <w:p>
       <w:r>
-        <w:t>Senior / Lead Unity Developer</w:t>
-      </w:r>
-      <w:r>
-        <w:t>,</w:t>
-      </w:r>
-      <w:r>
-        <w:t xml:space="preserve"> 15+ years in Game Development</w:t>
-      </w:r>
-      <w:r>
-        <w:t>,</w:t>
-      </w:r>
-      <w:r>
-        <w:t xml:space="preserve"> 18+ years in Software Development.</w:t>
+        <w:t>Software development since 2007; GameDev since 2011.</w:t>
       </w:r>
     </w:p>
     <w:p>
@@ -312,10 +300,7 @@
         <w:rPr>
           <w:b/>
         </w:rPr>
-        <w:t xml:space="preserve">Unity Development: </w:t>
-      </w:r>
-      <w:r>
-        <w:t>Unity 2D/3D, gameplay programming, UI programming, animation systems, ScriptableObject, DOTween, Spine, Steamworks, custom editor tools.</w:t>
+        <w:t>Unity Development: Unity 2D/3D, gameplay programming, UI programming, animation systems, Unity Addressables, UniTask, async/await, CancellationToken, ScriptableObject, DOTween, Spine, Steamworks, custom editor tools.</w:t>
       </w:r>
     </w:p>
     <w:p>
@@ -368,10 +353,7 @@
         <w:rPr>
           <w:b/>
         </w:rPr>
-        <w:t xml:space="preserve">Optimization &amp; Automation: </w:t>
-      </w:r>
-      <w:r>
-        <w:t>Memory optimization, build size optimization, performance optimization, crash reduction, Unity Memory Profiler, Bash, Rclone, Cron, CI/CD.</w:t>
+        <w:t>Optimization &amp; Automation: Memory optimization, build size optimization, performance optimization, crash reduction, Unity Memory Profiler, CI/CD (Jenkins, TeamCity), Bash, Rclone, Cron.</w:t>
       </w:r>
     </w:p>
     <w:p>
@@ -396,10 +378,7 @@
         <w:rPr>
           <w:b/>
         </w:rPr>
-        <w:t xml:space="preserve">Leadership &amp; Architecture: </w:t>
-      </w:r>
-      <w:r>
-        <w:t>Technical design, architecture, estimation, mentoring, team leadership, hiring, technical documentation, project audits.</w:t>
+        <w:t>Architecture &amp; Engineering Practices: Dependency Injection (Zenject), SOLID, KISS, DRY, YAGNI, modular architecture, refactoring, technical design. Leadership: estimation, mentoring, team leadership, hiring, technical documentation, project audits.</w:t>
       </w:r>
     </w:p>
     <w:p>
@@ -1140,6 +1119,76 @@
       </w:r>
       <w:r>
         <w:t>PHP, SQL, HTML, CSS, JavaScript, MySQL, Flash/ActionScript</w:t>
+      </w:r>
+    </w:p>
+    <w:p>
+      <w:pPr>
+        <w:pStyle w:val="1"/>
+        <w:pBdr>
+          <w:bottom w:val="single" w:sz="3" w:space="1" w:color="CBD5E1"/>
+        </w:pBdr>
+      </w:pPr>
+      <w:r>
+        <w:t>Independent Projects</w:t>
+      </w:r>
+    </w:p>
+    <w:p>
+      <w:pPr>
+        <w:pStyle w:val="21"/>
+        <w:spacing w:before="80" w:after="10"/>
+      </w:pPr>
+      <w:r>
+        <w:t>WordBattle — independent indie game</w:t>
+      </w:r>
+    </w:p>
+    <w:p>
+      <w:pPr>
+        <w:spacing w:after="10"/>
+      </w:pPr>
+      <w:r>
+        <w:rPr>
+          <w:i/>
+          <w:color w:val="4B5563"/>
+        </w:rPr>
+        <w:t>Unity / Android | In development and testing</w:t>
+      </w:r>
+      <w:r>
+        <w:t xml:space="preserve"> | </w:t>
+      </w:r>
+      <w:hyperlink r:id="rId11">
+        <w:r>
+          <w:rPr>
+            <w:rStyle w:val="Hyperlink"/>
+          </w:rPr>
+          <w:t>Portfolio case study</w:t>
+        </w:r>
+      </w:hyperlink>
+    </w:p>
+    <w:p>
+      <w:pPr>
+        <w:pStyle w:val="a0"/>
+      </w:pPr>
+      <w:r>
+        <w:t>Building a word strategy game against an AI opponent, owning architecture, word-search algorithms, gameplay, UI, SDK integrations and Android release preparation.</w:t>
+      </w:r>
+    </w:p>
+    <w:p>
+      <w:pPr>
+        <w:pStyle w:val="a0"/>
+      </w:pPr>
+      <w:r>
+        <w:t>Implementing game services, analytics and monetization with PlayFab, GameAnalytics, Google Play Billing and AdMob.</w:t>
+      </w:r>
+    </w:p>
+    <w:p>
+      <w:pPr>
+        <w:spacing w:after="20"/>
+      </w:pPr>
+      <w:r>
+        <w:rPr>
+          <w:b/>
+        </w:rPr>
+        <w:t>Technologies: Unity, C#, Unity Addressables, Zenject, UniTask, PlayFab, GameAnalytics, Google Play Billing, AdMob.</w:t>
       </w:r>
     </w:p>
     <w:p>

</xml_diff>

<commit_message>
docs: publish reviewed RU EN UA CVs to develop
Add synchronized CV texts, generated DOCX/PDF previews for RU EN UA, immutable base templates, and reproducible generation script. Stable master and production Cloudflare deployment are unchanged.
</commit_message>
<xml_diff>
--- a/Releases/EN/Yuriy_Kobylyatskiy_Senior_Unity_Developer_EN.docx
+++ b/Releases/EN/Yuriy_Kobylyatskiy_Senior_Unity_Developer_EN.docx
@@ -121,19 +121,7 @@
     </w:p>
     <w:p>
       <w:r>
-        <w:t>Senior / Lead Unity Developer</w:t>
-      </w:r>
-      <w:r>
-        <w:t>,</w:t>
-      </w:r>
-      <w:r>
-        <w:t xml:space="preserve"> 15+ years in Game Development</w:t>
-      </w:r>
-      <w:r>
-        <w:t>,</w:t>
-      </w:r>
-      <w:r>
-        <w:t xml:space="preserve"> 18+ years in Software Development.</w:t>
+        <w:t>Software development since 2007; GameDev since 2011.</w:t>
       </w:r>
     </w:p>
     <w:p>
@@ -312,10 +300,7 @@
         <w:rPr>
           <w:b/>
         </w:rPr>
-        <w:t xml:space="preserve">Unity Development: </w:t>
-      </w:r>
-      <w:r>
-        <w:t>Unity 2D/3D, gameplay programming, UI programming, animation systems, ScriptableObject, DOTween, Spine, Steamworks, custom editor tools.</w:t>
+        <w:t>Unity Development: Unity 2D/3D, gameplay programming, UI programming, animation systems, Unity Addressables, UniTask, async/await, CancellationToken, ScriptableObject, DOTween, Spine, Steamworks, custom editor tools.</w:t>
       </w:r>
     </w:p>
     <w:p>
@@ -368,10 +353,7 @@
         <w:rPr>
           <w:b/>
         </w:rPr>
-        <w:t xml:space="preserve">Optimization &amp; Automation: </w:t>
-      </w:r>
-      <w:r>
-        <w:t>Memory optimization, build size optimization, performance optimization, crash reduction, Unity Memory Profiler, Bash, Rclone, Cron, CI/CD.</w:t>
+        <w:t>Optimization &amp; Automation: Memory optimization, build size optimization, performance optimization, crash reduction, Unity Memory Profiler, CI/CD (Jenkins, TeamCity), Bash, Rclone, Cron.</w:t>
       </w:r>
     </w:p>
     <w:p>
@@ -396,10 +378,7 @@
         <w:rPr>
           <w:b/>
         </w:rPr>
-        <w:t xml:space="preserve">Leadership &amp; Architecture: </w:t>
-      </w:r>
-      <w:r>
-        <w:t>Technical design, architecture, estimation, mentoring, team leadership, hiring, technical documentation, project audits.</w:t>
+        <w:t>Architecture &amp; Engineering Practices: Dependency Injection (Zenject), SOLID, KISS, DRY, YAGNI, modular architecture, refactoring, technical design. Leadership: estimation, mentoring, team leadership, hiring, technical documentation, project audits.</w:t>
       </w:r>
     </w:p>
     <w:p>
@@ -1140,6 +1119,76 @@
       </w:r>
       <w:r>
         <w:t>PHP, SQL, HTML, CSS, JavaScript, MySQL, Flash/ActionScript</w:t>
+      </w:r>
+    </w:p>
+    <w:p>
+      <w:pPr>
+        <w:pStyle w:val="1"/>
+        <w:pBdr>
+          <w:bottom w:val="single" w:sz="3" w:space="1" w:color="CBD5E1"/>
+        </w:pBdr>
+      </w:pPr>
+      <w:r>
+        <w:t>Independent Projects</w:t>
+      </w:r>
+    </w:p>
+    <w:p>
+      <w:pPr>
+        <w:pStyle w:val="21"/>
+        <w:spacing w:before="80" w:after="10"/>
+      </w:pPr>
+      <w:r>
+        <w:t>WordBattle — independent indie game</w:t>
+      </w:r>
+    </w:p>
+    <w:p>
+      <w:pPr>
+        <w:spacing w:after="10"/>
+      </w:pPr>
+      <w:r>
+        <w:rPr>
+          <w:i/>
+          <w:color w:val="4B5563"/>
+        </w:rPr>
+        <w:t>Unity / Android | In development and testing</w:t>
+      </w:r>
+      <w:r>
+        <w:t xml:space="preserve"> | </w:t>
+      </w:r>
+      <w:hyperlink r:id="rId11">
+        <w:r>
+          <w:rPr>
+            <w:rStyle w:val="Hyperlink"/>
+          </w:rPr>
+          <w:t>Portfolio case study</w:t>
+        </w:r>
+      </w:hyperlink>
+    </w:p>
+    <w:p>
+      <w:pPr>
+        <w:pStyle w:val="a0"/>
+      </w:pPr>
+      <w:r>
+        <w:t>Building a word strategy game against an AI opponent, owning architecture, word-search algorithms, gameplay, UI, SDK integrations and Android release preparation.</w:t>
+      </w:r>
+    </w:p>
+    <w:p>
+      <w:pPr>
+        <w:pStyle w:val="a0"/>
+      </w:pPr>
+      <w:r>
+        <w:t>Implementing game services, analytics and monetization with PlayFab, GameAnalytics, Google Play Billing and AdMob.</w:t>
+      </w:r>
+    </w:p>
+    <w:p>
+      <w:pPr>
+        <w:spacing w:after="20"/>
+      </w:pPr>
+      <w:r>
+        <w:rPr>
+          <w:b/>
+        </w:rPr>
+        <w:t>Technologies: Unity, C#, Unity Addressables, Zenject, UniTask, PlayFab, GameAnalytics, Google Play Billing, AdMob.</w:t>
       </w:r>
     </w:p>
     <w:p>

</xml_diff>

<commit_message>
Text formatting has been corrected.
</commit_message>
<xml_diff>
--- a/Releases/EN/Yuriy_Kobylyatskiy_Senior_Unity_Developer_EN.docx
+++ b/Releases/EN/Yuriy_Kobylyatskiy_Senior_Unity_Developer_EN.docx
@@ -42,37 +42,26 @@
         <w:jc w:val="center"/>
       </w:pPr>
       <w:r>
-        <w:t xml:space="preserve">Ukraine | Remote only  |  +380957575677 (Telegram, Viber)  |  finmagnat@gmail.com  |  Portfolio: </w:t>
+        <w:t>Ukraine | Remote only  |  +380957575677 (</w:t>
       </w:r>
       <w:hyperlink r:id="rId6" w:history="1">
         <w:r>
           <w:rPr>
             <w:rStyle w:val="aff8"/>
           </w:rPr>
-          <w:t xml:space="preserve">Portfolio - </w:t>
+          <w:t>Telegram</w:t>
         </w:r>
-        <w:proofErr w:type="spellStart"/>
+      </w:hyperlink>
+      <w:r>
+        <w:t xml:space="preserve">, Viber)  |  finmagnat@gmail.com  |  Portfolio: </w:t>
+      </w:r>
+      <w:hyperlink r:id="rId7" w:history="1">
         <w:r>
           <w:rPr>
             <w:rStyle w:val="aff8"/>
           </w:rPr>
-          <w:t>Yuriy</w:t>
+          <w:t>Portfolio - Yuriy Kobylyatskiy</w:t>
         </w:r>
-        <w:proofErr w:type="spellEnd"/>
-        <w:r>
-          <w:rPr>
-            <w:rStyle w:val="aff8"/>
-          </w:rPr>
-          <w:t xml:space="preserve"> </w:t>
-        </w:r>
-        <w:proofErr w:type="spellStart"/>
-        <w:r>
-          <w:rPr>
-            <w:rStyle w:val="aff8"/>
-          </w:rPr>
-          <w:t>Kobylyatskiy</w:t>
-        </w:r>
-        <w:proofErr w:type="spellEnd"/>
       </w:hyperlink>
     </w:p>
     <w:p>
@@ -80,7 +69,7 @@
         <w:spacing w:after="0"/>
         <w:jc w:val="center"/>
       </w:pPr>
-      <w:hyperlink r:id="rId7">
+      <w:hyperlink r:id="rId8">
         <w:r>
           <w:rPr>
             <w:color w:val="1D4ED8"/>
@@ -91,7 +80,7 @@
       <w:r>
         <w:t xml:space="preserve">  |  </w:t>
       </w:r>
-      <w:hyperlink r:id="rId8">
+      <w:hyperlink r:id="rId9">
         <w:r>
           <w:rPr>
             <w:color w:val="1D4ED8"/>
@@ -300,7 +289,13 @@
         <w:rPr>
           <w:b/>
         </w:rPr>
-        <w:t>Unity Development: Unity 2D/3D, gameplay programming, UI programming, animation systems, Unity Addressables, UniTask, async/await, CancellationToken, ScriptableObject, DOTween, Spine, Steamworks, custom editor tools.</w:t>
+        <w:t xml:space="preserve">Unity Development: </w:t>
+      </w:r>
+      <w:r>
+        <w:rPr>
+          <w:bCs/>
+        </w:rPr>
+        <w:t>Unity 2D/3D, gameplay programming, UI programming, animation systems, Unity Addressables, UniTask, async/await, CancellationToken, ScriptableObject, DOTween, Spine, Steamworks, custom editor tools.</w:t>
       </w:r>
     </w:p>
     <w:p>
@@ -353,7 +348,13 @@
         <w:rPr>
           <w:b/>
         </w:rPr>
-        <w:t>Optimization &amp; Automation: Memory optimization, build size optimization, performance optimization, crash reduction, Unity Memory Profiler, CI/CD (Jenkins, TeamCity), Bash, Rclone, Cron.</w:t>
+        <w:t xml:space="preserve">Optimization &amp; Automation: </w:t>
+      </w:r>
+      <w:r>
+        <w:rPr>
+          <w:bCs/>
+        </w:rPr>
+        <w:t>Memory optimization, build size optimization, performance optimization, crash reduction, Unity Memory Profiler, CI/CD (Jenkins, TeamCity), Bash, Rclone, Cron.</w:t>
       </w:r>
     </w:p>
     <w:p>
@@ -378,7 +379,13 @@
         <w:rPr>
           <w:b/>
         </w:rPr>
-        <w:t>Architecture &amp; Engineering Practices: Dependency Injection (Zenject), SOLID, KISS, DRY, YAGNI, modular architecture, refactoring, technical design. Leadership: estimation, mentoring, team leadership, hiring, technical documentation, project audits.</w:t>
+        <w:t>Architecture &amp; Engineering Practices:</w:t>
+      </w:r>
+      <w:r>
+        <w:rPr>
+          <w:bCs/>
+        </w:rPr>
+        <w:t xml:space="preserve"> Dependency Injection (Zenject), SOLID, KISS, DRY, YAGNI, modular architecture, refactoring, technical design. Leadership: estimation, mentoring, team leadership, hiring, technical documentation, project audits.</w:t>
       </w:r>
     </w:p>
     <w:p>
@@ -1129,6 +1136,7 @@
         </w:pBdr>
       </w:pPr>
       <w:r>
+        <w:lastRenderedPageBreak/>
         <w:t>Independent Projects</w:t>
       </w:r>
     </w:p>
@@ -1155,11 +1163,8 @@
       <w:r>
         <w:t xml:space="preserve"> | </w:t>
       </w:r>
-      <w:hyperlink r:id="rId11">
+      <w:hyperlink r:id="rId10">
         <w:r>
-          <w:rPr>
-            <w:rStyle w:val="Hyperlink"/>
-          </w:rPr>
           <w:t>Portfolio case study</w:t>
         </w:r>
       </w:hyperlink>
@@ -1188,7 +1193,13 @@
         <w:rPr>
           <w:b/>
         </w:rPr>
-        <w:t>Technologies: Unity, C#, Unity Addressables, Zenject, UniTask, PlayFab, GameAnalytics, Google Play Billing, AdMob.</w:t>
+        <w:t>Technologies:</w:t>
+      </w:r>
+      <w:r>
+        <w:rPr>
+          <w:bCs/>
+        </w:rPr>
+        <w:t xml:space="preserve"> Unity, C#, Unity Addressables, Zenject, UniTask, PlayFab, GameAnalytics, Google Play Billing, AdMob.</w:t>
       </w:r>
     </w:p>
     <w:p>
@@ -1199,7 +1210,6 @@
         </w:pBdr>
       </w:pPr>
       <w:r>
-        <w:lastRenderedPageBreak/>
         <w:t>Technologies</w:t>
       </w:r>
     </w:p>

</xml_diff>

<commit_message>
release: stage hand-polished RU EN UA Senior Unity CVs
</commit_message>
<xml_diff>
--- a/Releases/EN/Yuriy_Kobylyatskiy_Senior_Unity_Developer_EN.docx
+++ b/Releases/EN/Yuriy_Kobylyatskiy_Senior_Unity_Developer_EN.docx
@@ -42,37 +42,26 @@
         <w:jc w:val="center"/>
       </w:pPr>
       <w:r>
-        <w:t xml:space="preserve">Ukraine | Remote only  |  +380957575677 (Telegram, Viber)  |  finmagnat@gmail.com  |  Portfolio: </w:t>
+        <w:t>Ukraine | Remote only  |  +380957575677 (</w:t>
       </w:r>
       <w:hyperlink r:id="rId6" w:history="1">
         <w:r>
           <w:rPr>
             <w:rStyle w:val="aff8"/>
           </w:rPr>
-          <w:t xml:space="preserve">Portfolio - </w:t>
+          <w:t>Telegram</w:t>
         </w:r>
-        <w:proofErr w:type="spellStart"/>
+      </w:hyperlink>
+      <w:r>
+        <w:t xml:space="preserve">, Viber)  |  finmagnat@gmail.com  |  Portfolio: </w:t>
+      </w:r>
+      <w:hyperlink r:id="rId7" w:history="1">
         <w:r>
           <w:rPr>
             <w:rStyle w:val="aff8"/>
           </w:rPr>
-          <w:t>Yuriy</w:t>
+          <w:t>Portfolio - Yuriy Kobylyatskiy</w:t>
         </w:r>
-        <w:proofErr w:type="spellEnd"/>
-        <w:r>
-          <w:rPr>
-            <w:rStyle w:val="aff8"/>
-          </w:rPr>
-          <w:t xml:space="preserve"> </w:t>
-        </w:r>
-        <w:proofErr w:type="spellStart"/>
-        <w:r>
-          <w:rPr>
-            <w:rStyle w:val="aff8"/>
-          </w:rPr>
-          <w:t>Kobylyatskiy</w:t>
-        </w:r>
-        <w:proofErr w:type="spellEnd"/>
       </w:hyperlink>
     </w:p>
     <w:p>
@@ -80,7 +69,7 @@
         <w:spacing w:after="0"/>
         <w:jc w:val="center"/>
       </w:pPr>
-      <w:hyperlink r:id="rId7">
+      <w:hyperlink r:id="rId8">
         <w:r>
           <w:rPr>
             <w:color w:val="1D4ED8"/>
@@ -91,7 +80,7 @@
       <w:r>
         <w:t xml:space="preserve">  |  </w:t>
       </w:r>
-      <w:hyperlink r:id="rId8">
+      <w:hyperlink r:id="rId9">
         <w:r>
           <w:rPr>
             <w:color w:val="1D4ED8"/>
@@ -121,19 +110,7 @@
     </w:p>
     <w:p>
       <w:r>
-        <w:t>Senior / Lead Unity Developer</w:t>
-      </w:r>
-      <w:r>
-        <w:t>,</w:t>
-      </w:r>
-      <w:r>
-        <w:t xml:space="preserve"> 15+ years in Game Development</w:t>
-      </w:r>
-      <w:r>
-        <w:t>,</w:t>
-      </w:r>
-      <w:r>
-        <w:t xml:space="preserve"> 18+ years in Software Development.</w:t>
+        <w:t>Software development since 2007; GameDev since 2011.</w:t>
       </w:r>
     </w:p>
     <w:p>
@@ -315,7 +292,10 @@
         <w:t xml:space="preserve">Unity Development: </w:t>
       </w:r>
       <w:r>
-        <w:t>Unity 2D/3D, gameplay programming, UI programming, animation systems, ScriptableObject, DOTween, Spine, Steamworks, custom editor tools.</w:t>
+        <w:rPr>
+          <w:bCs/>
+        </w:rPr>
+        <w:t>Unity 2D/3D, gameplay programming, UI programming, animation systems, Unity Addressables, UniTask, async/await, CancellationToken, ScriptableObject, DOTween, Spine, Steamworks, custom editor tools.</w:t>
       </w:r>
     </w:p>
     <w:p>
@@ -371,7 +351,10 @@
         <w:t xml:space="preserve">Optimization &amp; Automation: </w:t>
       </w:r>
       <w:r>
-        <w:t>Memory optimization, build size optimization, performance optimization, crash reduction, Unity Memory Profiler, Bash, Rclone, Cron, CI/CD.</w:t>
+        <w:rPr>
+          <w:bCs/>
+        </w:rPr>
+        <w:t>Memory optimization, build size optimization, performance optimization, crash reduction, Unity Memory Profiler, CI/CD (Jenkins, TeamCity), Bash, Rclone, Cron.</w:t>
       </w:r>
     </w:p>
     <w:p>
@@ -396,10 +379,13 @@
         <w:rPr>
           <w:b/>
         </w:rPr>
-        <w:t xml:space="preserve">Leadership &amp; Architecture: </w:t>
-      </w:r>
-      <w:r>
-        <w:t>Technical design, architecture, estimation, mentoring, team leadership, hiring, technical documentation, project audits.</w:t>
+        <w:t>Architecture &amp; Engineering Practices:</w:t>
+      </w:r>
+      <w:r>
+        <w:rPr>
+          <w:bCs/>
+        </w:rPr>
+        <w:t xml:space="preserve"> Dependency Injection (Zenject), SOLID, KISS, DRY, YAGNI, modular architecture, refactoring, technical design. Leadership: estimation, mentoring, team leadership, hiring, technical documentation, project audits.</w:t>
       </w:r>
     </w:p>
     <w:p>
@@ -1151,6 +1137,79 @@
       </w:pPr>
       <w:r>
         <w:lastRenderedPageBreak/>
+        <w:t>Independent Projects</w:t>
+      </w:r>
+    </w:p>
+    <w:p>
+      <w:pPr>
+        <w:pStyle w:val="21"/>
+        <w:spacing w:before="80" w:after="10"/>
+      </w:pPr>
+      <w:r>
+        <w:t>WordBattle — independent indie game</w:t>
+      </w:r>
+    </w:p>
+    <w:p>
+      <w:pPr>
+        <w:spacing w:after="10"/>
+      </w:pPr>
+      <w:r>
+        <w:rPr>
+          <w:i/>
+          <w:color w:val="4B5563"/>
+        </w:rPr>
+        <w:t>Unity / Android | In development and testing</w:t>
+      </w:r>
+      <w:r>
+        <w:t xml:space="preserve"> | </w:t>
+      </w:r>
+      <w:hyperlink r:id="rId10">
+        <w:r>
+          <w:t>Portfolio case study</w:t>
+        </w:r>
+      </w:hyperlink>
+    </w:p>
+    <w:p>
+      <w:pPr>
+        <w:pStyle w:val="a0"/>
+      </w:pPr>
+      <w:r>
+        <w:t>Building a word strategy game against an AI opponent, owning architecture, word-search algorithms, gameplay, UI, SDK integrations and Android release preparation.</w:t>
+      </w:r>
+    </w:p>
+    <w:p>
+      <w:pPr>
+        <w:pStyle w:val="a0"/>
+      </w:pPr>
+      <w:r>
+        <w:t>Implementing game services, analytics and monetization with PlayFab, GameAnalytics, Google Play Billing and AdMob.</w:t>
+      </w:r>
+    </w:p>
+    <w:p>
+      <w:pPr>
+        <w:spacing w:after="20"/>
+      </w:pPr>
+      <w:r>
+        <w:rPr>
+          <w:b/>
+        </w:rPr>
+        <w:t>Technologies:</w:t>
+      </w:r>
+      <w:r>
+        <w:rPr>
+          <w:bCs/>
+        </w:rPr>
+        <w:t xml:space="preserve"> Unity, C#, Unity Addressables, Zenject, UniTask, PlayFab, GameAnalytics, Google Play Billing, AdMob.</w:t>
+      </w:r>
+    </w:p>
+    <w:p>
+      <w:pPr>
+        <w:pStyle w:val="1"/>
+        <w:pBdr>
+          <w:bottom w:val="single" w:sz="3" w:space="1" w:color="CBD5E1"/>
+        </w:pBdr>
+      </w:pPr>
+      <w:r>
         <w:t>Technologies</w:t>
       </w:r>
     </w:p>

</xml_diff>

<commit_message>
release: approved RU EN UA CVs and production PDF hook
Publish hand-polished RU/EN/UA DOCX/PDF releases and include the Ukrainian PDF in the existing Cloudflare deploy hook. Do not modify private game sources.
</commit_message>
<xml_diff>
--- a/Releases/EN/Yuriy_Kobylyatskiy_Senior_Unity_Developer_EN.docx
+++ b/Releases/EN/Yuriy_Kobylyatskiy_Senior_Unity_Developer_EN.docx
@@ -42,37 +42,26 @@
         <w:jc w:val="center"/>
       </w:pPr>
       <w:r>
-        <w:t xml:space="preserve">Ukraine | Remote only  |  +380957575677 (Telegram, Viber)  |  finmagnat@gmail.com  |  Portfolio: </w:t>
+        <w:t>Ukraine | Remote only  |  +380957575677 (</w:t>
       </w:r>
       <w:hyperlink r:id="rId6" w:history="1">
         <w:r>
           <w:rPr>
             <w:rStyle w:val="aff8"/>
           </w:rPr>
-          <w:t xml:space="preserve">Portfolio - </w:t>
+          <w:t>Telegram</w:t>
         </w:r>
-        <w:proofErr w:type="spellStart"/>
+      </w:hyperlink>
+      <w:r>
+        <w:t xml:space="preserve">, Viber)  |  finmagnat@gmail.com  |  Portfolio: </w:t>
+      </w:r>
+      <w:hyperlink r:id="rId7" w:history="1">
         <w:r>
           <w:rPr>
             <w:rStyle w:val="aff8"/>
           </w:rPr>
-          <w:t>Yuriy</w:t>
+          <w:t>Portfolio - Yuriy Kobylyatskiy</w:t>
         </w:r>
-        <w:proofErr w:type="spellEnd"/>
-        <w:r>
-          <w:rPr>
-            <w:rStyle w:val="aff8"/>
-          </w:rPr>
-          <w:t xml:space="preserve"> </w:t>
-        </w:r>
-        <w:proofErr w:type="spellStart"/>
-        <w:r>
-          <w:rPr>
-            <w:rStyle w:val="aff8"/>
-          </w:rPr>
-          <w:t>Kobylyatskiy</w:t>
-        </w:r>
-        <w:proofErr w:type="spellEnd"/>
       </w:hyperlink>
     </w:p>
     <w:p>
@@ -80,7 +69,7 @@
         <w:spacing w:after="0"/>
         <w:jc w:val="center"/>
       </w:pPr>
-      <w:hyperlink r:id="rId7">
+      <w:hyperlink r:id="rId8">
         <w:r>
           <w:rPr>
             <w:color w:val="1D4ED8"/>
@@ -91,7 +80,7 @@
       <w:r>
         <w:t xml:space="preserve">  |  </w:t>
       </w:r>
-      <w:hyperlink r:id="rId8">
+      <w:hyperlink r:id="rId9">
         <w:r>
           <w:rPr>
             <w:color w:val="1D4ED8"/>
@@ -121,19 +110,7 @@
     </w:p>
     <w:p>
       <w:r>
-        <w:t>Senior / Lead Unity Developer</w:t>
-      </w:r>
-      <w:r>
-        <w:t>,</w:t>
-      </w:r>
-      <w:r>
-        <w:t xml:space="preserve"> 15+ years in Game Development</w:t>
-      </w:r>
-      <w:r>
-        <w:t>,</w:t>
-      </w:r>
-      <w:r>
-        <w:t xml:space="preserve"> 18+ years in Software Development.</w:t>
+        <w:t>Software development since 2007; GameDev since 2011.</w:t>
       </w:r>
     </w:p>
     <w:p>
@@ -315,7 +292,10 @@
         <w:t xml:space="preserve">Unity Development: </w:t>
       </w:r>
       <w:r>
-        <w:t>Unity 2D/3D, gameplay programming, UI programming, animation systems, ScriptableObject, DOTween, Spine, Steamworks, custom editor tools.</w:t>
+        <w:rPr>
+          <w:bCs/>
+        </w:rPr>
+        <w:t>Unity 2D/3D, gameplay programming, UI programming, animation systems, Unity Addressables, UniTask, async/await, CancellationToken, ScriptableObject, DOTween, Spine, Steamworks, custom editor tools.</w:t>
       </w:r>
     </w:p>
     <w:p>
@@ -371,7 +351,10 @@
         <w:t xml:space="preserve">Optimization &amp; Automation: </w:t>
       </w:r>
       <w:r>
-        <w:t>Memory optimization, build size optimization, performance optimization, crash reduction, Unity Memory Profiler, Bash, Rclone, Cron, CI/CD.</w:t>
+        <w:rPr>
+          <w:bCs/>
+        </w:rPr>
+        <w:t>Memory optimization, build size optimization, performance optimization, crash reduction, Unity Memory Profiler, CI/CD (Jenkins, TeamCity), Bash, Rclone, Cron.</w:t>
       </w:r>
     </w:p>
     <w:p>
@@ -396,10 +379,13 @@
         <w:rPr>
           <w:b/>
         </w:rPr>
-        <w:t xml:space="preserve">Leadership &amp; Architecture: </w:t>
-      </w:r>
-      <w:r>
-        <w:t>Technical design, architecture, estimation, mentoring, team leadership, hiring, technical documentation, project audits.</w:t>
+        <w:t>Architecture &amp; Engineering Practices:</w:t>
+      </w:r>
+      <w:r>
+        <w:rPr>
+          <w:bCs/>
+        </w:rPr>
+        <w:t xml:space="preserve"> Dependency Injection (Zenject), SOLID, KISS, DRY, YAGNI, modular architecture, refactoring, technical design. Leadership: estimation, mentoring, team leadership, hiring, technical documentation, project audits.</w:t>
       </w:r>
     </w:p>
     <w:p>
@@ -1151,6 +1137,79 @@
       </w:pPr>
       <w:r>
         <w:lastRenderedPageBreak/>
+        <w:t>Independent Projects</w:t>
+      </w:r>
+    </w:p>
+    <w:p>
+      <w:pPr>
+        <w:pStyle w:val="21"/>
+        <w:spacing w:before="80" w:after="10"/>
+      </w:pPr>
+      <w:r>
+        <w:t>WordBattle — independent indie game</w:t>
+      </w:r>
+    </w:p>
+    <w:p>
+      <w:pPr>
+        <w:spacing w:after="10"/>
+      </w:pPr>
+      <w:r>
+        <w:rPr>
+          <w:i/>
+          <w:color w:val="4B5563"/>
+        </w:rPr>
+        <w:t>Unity / Android | In development and testing</w:t>
+      </w:r>
+      <w:r>
+        <w:t xml:space="preserve"> | </w:t>
+      </w:r>
+      <w:hyperlink r:id="rId10">
+        <w:r>
+          <w:t>Portfolio case study</w:t>
+        </w:r>
+      </w:hyperlink>
+    </w:p>
+    <w:p>
+      <w:pPr>
+        <w:pStyle w:val="a0"/>
+      </w:pPr>
+      <w:r>
+        <w:t>Building a word strategy game against an AI opponent, owning architecture, word-search algorithms, gameplay, UI, SDK integrations and Android release preparation.</w:t>
+      </w:r>
+    </w:p>
+    <w:p>
+      <w:pPr>
+        <w:pStyle w:val="a0"/>
+      </w:pPr>
+      <w:r>
+        <w:t>Implementing game services, analytics and monetization with PlayFab, GameAnalytics, Google Play Billing and AdMob.</w:t>
+      </w:r>
+    </w:p>
+    <w:p>
+      <w:pPr>
+        <w:spacing w:after="20"/>
+      </w:pPr>
+      <w:r>
+        <w:rPr>
+          <w:b/>
+        </w:rPr>
+        <w:t>Technologies:</w:t>
+      </w:r>
+      <w:r>
+        <w:rPr>
+          <w:bCs/>
+        </w:rPr>
+        <w:t xml:space="preserve"> Unity, C#, Unity Addressables, Zenject, UniTask, PlayFab, GameAnalytics, Google Play Billing, AdMob.</w:t>
+      </w:r>
+    </w:p>
+    <w:p>
+      <w:pPr>
+        <w:pStyle w:val="1"/>
+        <w:pBdr>
+          <w:bottom w:val="single" w:sz="3" w:space="1" w:color="CBD5E1"/>
+        </w:pBdr>
+      </w:pPr>
+      <w:r>
         <w:t>Technologies</w:t>
       </w:r>
     </w:p>

</xml_diff>